<commit_message>
Corresponding author: Adwit Agarwal
Co-Authored-By: Claude Opus 5.5 <noreply@anthropic.com>
</commit_message>
<xml_diff>
--- a/ICINCDS_2026_Manuscript_NHANES_CVD_v3.docx
+++ b/ICINCDS_2026_Manuscript_NHANES_CVD_v3.docx
@@ -66,7 +66,7 @@
                 <w:sz w:val="24"/>
                 <w:szCs w:val="24"/>
               </w:rPr>
-              <w:t xml:space="preserve">Adwit Agarwal</w:t>
+              <w:t xml:space="preserve">Adwit Agarwal*</w:t>
             </w:r>
           </w:p>
           <w:p>
@@ -155,7 +155,7 @@
                 <w:sz w:val="24"/>
                 <w:szCs w:val="24"/>
               </w:rPr>
-              <w:t xml:space="preserve">Nilay Sengupta*</w:t>
+              <w:t xml:space="preserve">Nilay Sengupta</w:t>
             </w:r>
           </w:p>
           <w:p>
@@ -429,7 +429,7 @@
         <w:rPr>
           <w:rFonts w:ascii="Times New Roman" w:cs="Times New Roman" w:eastAsia="Times New Roman" w:hAnsi="Times New Roman"/>
         </w:rPr>
-        <w:t xml:space="preserve">*Corresponding author: nilay.sengupta2025a@vitstudent.ac.in</w:t>
+        <w:t xml:space="preserve">*Corresponding author: adwit.agarwal2025@vitstudent.ac.in</w:t>
       </w:r>
     </w:p>
     <w:p>

</xml_diff>